<commit_message>
docs: update memoria tecnica PDF and entregable docx
Co-Authored-By: Claude Sonnet 4.6 <noreply@anthropic.com>
</commit_message>
<xml_diff>
--- a/entregable5.docx
+++ b/entregable5.docx
@@ -194,15 +194,7 @@
         <w:pStyle w:val="Vietaprimernivel"/>
       </w:pPr>
       <w:r>
-        <w:t xml:space="preserve">Define un </w:t>
-      </w:r>
-      <w:proofErr w:type="gramStart"/>
-      <w:r>
-        <w:t>archivo .env</w:t>
-      </w:r>
-      <w:proofErr w:type="gramEnd"/>
-      <w:r>
-        <w:t xml:space="preserve"> con las credenciales y parámetros de conexión de la base de datos.</w:t>
+        <w:t>Define un archivo .env con las credenciales y parámetros de conexión de la base de datos.</w:t>
       </w:r>
     </w:p>
     <w:p/>
@@ -219,14 +211,9 @@
       <w:pPr>
         <w:pStyle w:val="ListanumeradaTEST"/>
       </w:pPr>
-      <w:proofErr w:type="spellStart"/>
       <w:r>
         <w:lastRenderedPageBreak/>
-        <w:t>Contenerización</w:t>
-      </w:r>
-      <w:proofErr w:type="spellEnd"/>
-      <w:r>
-        <w:t xml:space="preserve"> de la </w:t>
+        <w:t xml:space="preserve">Contenerización de la </w:t>
       </w:r>
       <w:r>
         <w:t>a</w:t>
@@ -354,15 +341,7 @@
         <w:ind w:left="284"/>
       </w:pPr>
       <w:r>
-        <w:t>az acr login --name &lt;</w:t>
-      </w:r>
-      <w:proofErr w:type="spellStart"/>
-      <w:r>
-        <w:t>tu_acr</w:t>
-      </w:r>
-      <w:proofErr w:type="spellEnd"/>
-      <w:r>
-        <w:t>&gt;</w:t>
+        <w:t>az acr login --name &lt;tu_acr&gt;</w:t>
       </w:r>
     </w:p>
     <w:p>
@@ -519,15 +498,7 @@
         <w:t>logs</w:t>
       </w:r>
       <w:r>
-        <w:t xml:space="preserve"> de la aplicación con az containerapp logs </w:t>
-      </w:r>
-      <w:proofErr w:type="gramStart"/>
-      <w:r>
-        <w:t>show</w:t>
-      </w:r>
-      <w:proofErr w:type="gramEnd"/>
-      <w:r>
-        <w:t xml:space="preserve"> --name mi-backend.</w:t>
+        <w:t xml:space="preserve"> de la aplicación con az containerapp logs show --name mi-backend.</w:t>
       </w:r>
     </w:p>
     <w:p>
@@ -1088,36 +1059,8 @@
                 <w:sz w:val="20"/>
                 <w:szCs w:val="20"/>
               </w:rPr>
-              <w:t xml:space="preserve">Creación adecuada del </w:t>
+              <w:t>Creación adecuada del Dockerfile y docker-compose.yml</w:t>
             </w:r>
-            <w:proofErr w:type="spellStart"/>
-            <w:r>
-              <w:rPr>
-                <w:rFonts w:cs="UnitOT-Light"/>
-                <w:sz w:val="20"/>
-                <w:szCs w:val="20"/>
-              </w:rPr>
-              <w:t>Dockerfile</w:t>
-            </w:r>
-            <w:proofErr w:type="spellEnd"/>
-            <w:r>
-              <w:rPr>
-                <w:rFonts w:cs="UnitOT-Light"/>
-                <w:sz w:val="20"/>
-                <w:szCs w:val="20"/>
-              </w:rPr>
-              <w:t xml:space="preserve"> y </w:t>
-            </w:r>
-            <w:proofErr w:type="spellStart"/>
-            <w:r>
-              <w:rPr>
-                <w:rFonts w:cs="UnitOT-Light"/>
-                <w:sz w:val="20"/>
-                <w:szCs w:val="20"/>
-              </w:rPr>
-              <w:t>docker-compose.yml</w:t>
-            </w:r>
-            <w:proofErr w:type="spellEnd"/>
             <w:r>
               <w:rPr>
                 <w:rFonts w:cs="UnitOT-Light"/>
@@ -1418,7 +1361,7 @@
               <w:tblLook w:val="04A0" w:firstRow="1" w:lastRow="0" w:firstColumn="1" w:lastColumn="0" w:noHBand="0" w:noVBand="1"/>
             </w:tblPr>
             <w:tblGrid>
-              <w:gridCol w:w="1370"/>
+              <w:gridCol w:w="1750"/>
             </w:tblGrid>
             <w:tr>
               <w:trPr>
@@ -1545,18 +1488,8 @@
                 <w:sz w:val="20"/>
                 <w:szCs w:val="20"/>
               </w:rPr>
-              <w:t xml:space="preserve">Configuración y ejecución en Container Apps o Container </w:t>
+              <w:t>Configuración y ejecución en Container Apps o Container Instances</w:t>
             </w:r>
-            <w:proofErr w:type="spellStart"/>
-            <w:r>
-              <w:rPr>
-                <w:rFonts w:cs="UnitOT-Light"/>
-                <w:sz w:val="20"/>
-                <w:szCs w:val="20"/>
-              </w:rPr>
-              <w:t>Instances</w:t>
-            </w:r>
-            <w:proofErr w:type="spellEnd"/>
             <w:r>
               <w:rPr>
                 <w:rFonts w:cs="UnitOT-Light"/>
@@ -2091,6 +2024,75 @@
         </w:tc>
       </w:tr>
     </w:tbl>
+    <w:p>
+      <w:pPr>
+        <w:spacing w:after="160" w:line="259" w:lineRule="auto"/>
+        <w:jc w:val="left"/>
+        <w:rPr>
+          <w:rFonts w:cs="UnitOT-Light"/>
+        </w:rPr>
+      </w:pPr>
+    </w:p>
+    <w:p>
+      <w:pPr>
+        <w:spacing w:after="160" w:line="259" w:lineRule="auto"/>
+        <w:jc w:val="left"/>
+        <w:rPr>
+          <w:rFonts w:cs="UnitOT-Light"/>
+        </w:rPr>
+      </w:pPr>
+    </w:p>
+    <w:p>
+      <w:pPr>
+        <w:spacing w:after="160" w:line="259" w:lineRule="auto"/>
+        <w:jc w:val="left"/>
+        <w:rPr>
+          <w:rFonts w:cs="UnitOT-Light"/>
+        </w:rPr>
+      </w:pPr>
+    </w:p>
+    <w:p>
+      <w:pPr>
+        <w:spacing w:after="160" w:line="259" w:lineRule="auto"/>
+        <w:jc w:val="left"/>
+        <w:rPr>
+          <w:rFonts w:cs="UnitOT-Light"/>
+        </w:rPr>
+      </w:pPr>
+    </w:p>
+    <w:p>
+      <w:pPr>
+        <w:spacing w:after="160" w:line="259" w:lineRule="auto"/>
+        <w:jc w:val="left"/>
+        <w:rPr>
+          <w:rFonts w:cs="UnitOT-Light"/>
+        </w:rPr>
+      </w:pPr>
+    </w:p>
+    <w:p>
+      <w:pPr>
+        <w:spacing w:after="160" w:line="259" w:lineRule="auto"/>
+        <w:jc w:val="left"/>
+        <w:rPr>
+          <w:rFonts w:cs="UnitOT-Light"/>
+        </w:rPr>
+      </w:pPr>
+      <w:r>
+        <w:rPr>
+          <w:rFonts w:cs="UnitOT-Light"/>
+        </w:rPr>
+        <w:t>MEMORIA TÉCNICA:</w:t>
+      </w:r>
+    </w:p>
+    <w:p>
+      <w:pPr>
+        <w:spacing w:after="160" w:line="259" w:lineRule="auto"/>
+        <w:jc w:val="left"/>
+        <w:rPr>
+          <w:rFonts w:cs="UnitOT-Light"/>
+        </w:rPr>
+      </w:pPr>
+    </w:p>
     <w:p>
       <w:pPr>
         <w:spacing w:after="160" w:line="259" w:lineRule="auto"/>
@@ -2535,6 +2537,13 @@
             </w:rPr>
             <w:t xml:space="preserve">Apellidos: </w:t>
           </w:r>
+          <w:r>
+            <w:rPr>
+              <w:sz w:val="22"/>
+              <w:szCs w:val="22"/>
+            </w:rPr>
+            <w:t>FRAGA ALONSO</w:t>
+          </w:r>
         </w:p>
       </w:tc>
       <w:tc>
@@ -2550,6 +2559,12 @@
               <w:rFonts w:asciiTheme="minorHAnsi" w:hAnsiTheme="minorHAnsi"/>
             </w:rPr>
           </w:pPr>
+          <w:r>
+            <w:rPr>
+              <w:rFonts w:asciiTheme="minorHAnsi" w:hAnsiTheme="minorHAnsi"/>
+            </w:rPr>
+            <w:t>12/06/2026</w:t>
+          </w:r>
         </w:p>
       </w:tc>
     </w:tr>
@@ -2586,6 +2601,13 @@
               <w:szCs w:val="22"/>
             </w:rPr>
             <w:t>Nombre:</w:t>
+          </w:r>
+          <w:r>
+            <w:rPr>
+              <w:sz w:val="22"/>
+              <w:szCs w:val="22"/>
+            </w:rPr>
+            <w:t xml:space="preserve"> ALEJANDRO</w:t>
           </w:r>
         </w:p>
       </w:tc>
@@ -5557,7 +5579,6 @@
   <w:style w:type="character" w:default="1" w:styleId="Fuentedeprrafopredeter">
     <w:name w:val="Default Paragraph Font"/>
     <w:uiPriority w:val="1"/>
-    <w:semiHidden/>
     <w:unhideWhenUsed/>
   </w:style>
   <w:style w:type="table" w:default="1" w:styleId="Tablanormal">
@@ -7109,6 +7130,10 @@
 </file>
 
 <file path=customXml/item1.xml><?xml version="1.0" encoding="utf-8"?>
+<b:Sources xmlns:b="http://schemas.openxmlformats.org/officeDocument/2006/bibliography" xmlns="http://schemas.openxmlformats.org/officeDocument/2006/bibliography" SelectedStyle="\APASixthEditionOfficeOnline.xsl" StyleName="APA" Version="6"/>
+</file>
+
+<file path=customXml/item2.xml><?xml version="1.0" encoding="utf-8"?>
 <p:properties xmlns:p="http://schemas.microsoft.com/office/2006/metadata/properties" xmlns:xsi="http://www.w3.org/2001/XMLSchema-instance" xmlns:pc="http://schemas.microsoft.com/office/infopath/2007/PartnerControls">
   <documentManagement>
     <lcf76f155ced4ddcb4097134ff3c332f xmlns="27c1adeb-3674-457c-b08c-8a73f31b6e23">
@@ -7128,20 +7153,7 @@
 </p:properties>
 </file>
 
-<file path=customXml/item2.xml><?xml version="1.0" encoding="utf-8"?>
-<b:Sources xmlns:b="http://schemas.openxmlformats.org/officeDocument/2006/bibliography" xmlns="http://schemas.openxmlformats.org/officeDocument/2006/bibliography" SelectedStyle="\APASixthEditionOfficeOnline.xsl" StyleName="APA" Version="6"/>
-</file>
-
 <file path=customXml/item3.xml><?xml version="1.0" encoding="utf-8"?>
-<?mso-contentType ?>
-<FormTemplates xmlns="http://schemas.microsoft.com/sharepoint/v3/contenttype/forms">
-  <Display>DocumentLibraryForm</Display>
-  <Edit>DocumentLibraryForm</Edit>
-  <New>DocumentLibraryForm</New>
-</FormTemplates>
-</file>
-
-<file path=customXml/item4.xml><?xml version="1.0" encoding="utf-8"?>
 <ct:contentTypeSchema xmlns:ct="http://schemas.microsoft.com/office/2006/metadata/contentType" xmlns:ma="http://schemas.microsoft.com/office/2006/metadata/properties/metaAttributes" ct:_="" ma:_="" ma:contentTypeName="Documento" ma:contentTypeID="0x010100DF3D7C797EA12745A270EF30E38719B9" ma:contentTypeVersion="20" ma:contentTypeDescription="Crear nuevo documento." ma:contentTypeScope="" ma:versionID="98b23ce13f8ef13134c980882a27b8cc">
   <xsd:schema xmlns:xsd="http://www.w3.org/2001/XMLSchema" xmlns:xs="http://www.w3.org/2001/XMLSchema" xmlns:p="http://schemas.microsoft.com/office/2006/metadata/properties" xmlns:ns2="0a70e875-3d35-4be2-921f-7117c31bab9b" xmlns:ns3="27c1adeb-3674-457c-b08c-8a73f31b6e23" targetNamespace="http://schemas.microsoft.com/office/2006/metadata/properties" ma:root="true" ma:fieldsID="83d50475b18a8f95f7f8edf1c6caa3f2" ns2:_="" ns3:_="">
     <xsd:import namespace="0a70e875-3d35-4be2-921f-7117c31bab9b"/>
@@ -7408,7 +7420,24 @@
 </ct:contentTypeSchema>
 </file>
 
+<file path=customXml/item4.xml><?xml version="1.0" encoding="utf-8"?>
+<?mso-contentType ?>
+<FormTemplates xmlns="http://schemas.microsoft.com/sharepoint/v3/contenttype/forms">
+  <Display>DocumentLibraryForm</Display>
+  <Edit>DocumentLibraryForm</Edit>
+  <New>DocumentLibraryForm</New>
+</FormTemplates>
+</file>
+
 <file path=customXml/itemProps1.xml><?xml version="1.0" encoding="utf-8"?>
+<ds:datastoreItem xmlns:ds="http://schemas.openxmlformats.org/officeDocument/2006/customXml" ds:itemID="{ED64A034-5F71-460F-B8D2-7705D0E3A65B}">
+  <ds:schemaRefs>
+    <ds:schemaRef ds:uri="http://schemas.openxmlformats.org/officeDocument/2006/bibliography"/>
+  </ds:schemaRefs>
+</ds:datastoreItem>
+</file>
+
+<file path=customXml/itemProps2.xml><?xml version="1.0" encoding="utf-8"?>
 <ds:datastoreItem xmlns:ds="http://schemas.openxmlformats.org/officeDocument/2006/customXml" ds:itemID="{524B6230-BF42-4C4C-9E11-338ABA133D3E}">
   <ds:schemaRefs>
     <ds:schemaRef ds:uri="http://schemas.microsoft.com/office/2006/metadata/properties"/>
@@ -7419,22 +7448,29 @@
 </ds:datastoreItem>
 </file>
 
-<file path=customXml/itemProps2.xml><?xml version="1.0" encoding="utf-8"?>
-<ds:datastoreItem xmlns:ds="http://schemas.openxmlformats.org/officeDocument/2006/customXml" ds:itemID="{ED64A034-5F71-460F-B8D2-7705D0E3A65B}">
+<file path=customXml/itemProps3.xml><?xml version="1.0" encoding="utf-8"?>
+<ds:datastoreItem xmlns:ds="http://schemas.openxmlformats.org/officeDocument/2006/customXml" ds:itemID="{0D1AF95B-4303-497E-BDC3-00D7D69BA2FC}">
   <ds:schemaRefs>
-    <ds:schemaRef ds:uri="http://schemas.openxmlformats.org/officeDocument/2006/bibliography"/>
+    <ds:schemaRef ds:uri="http://schemas.microsoft.com/office/2006/metadata/contentType"/>
+    <ds:schemaRef ds:uri="http://schemas.microsoft.com/office/2006/metadata/properties/metaAttributes"/>
+    <ds:schemaRef ds:uri="http://www.w3.org/2001/XMLSchema"/>
+    <ds:schemaRef ds:uri="http://schemas.microsoft.com/office/2006/metadata/properties"/>
+    <ds:schemaRef ds:uri="0a70e875-3d35-4be2-921f-7117c31bab9b"/>
+    <ds:schemaRef ds:uri="27c1adeb-3674-457c-b08c-8a73f31b6e23"/>
+    <ds:schemaRef ds:uri="http://schemas.microsoft.com/office/2006/documentManagement/types"/>
+    <ds:schemaRef ds:uri="http://schemas.microsoft.com/office/infopath/2007/PartnerControls"/>
+    <ds:schemaRef ds:uri="http://schemas.openxmlformats.org/package/2006/metadata/core-properties"/>
+    <ds:schemaRef ds:uri="http://purl.org/dc/elements/1.1/"/>
+    <ds:schemaRef ds:uri="http://purl.org/dc/terms/"/>
+    <ds:schemaRef ds:uri="http://schemas.microsoft.com/internal/obd"/>
   </ds:schemaRefs>
 </ds:datastoreItem>
 </file>
 
-<file path=customXml/itemProps3.xml><?xml version="1.0" encoding="utf-8"?>
+<file path=customXml/itemProps4.xml><?xml version="1.0" encoding="utf-8"?>
 <ds:datastoreItem xmlns:ds="http://schemas.openxmlformats.org/officeDocument/2006/customXml" ds:itemID="{8D9D84D8-2D2F-4DC4-A93D-919C34237140}">
   <ds:schemaRefs>
     <ds:schemaRef ds:uri="http://schemas.microsoft.com/sharepoint/v3/contenttype/forms"/>
   </ds:schemaRefs>
 </ds:datastoreItem>
-</file>
-
-<file path=customXml/itemProps4.xml><?xml version="1.0" encoding="utf-8"?>
-<ds:datastoreItem xmlns:ds="http://schemas.openxmlformats.org/officeDocument/2006/customXml" ds:itemID="{0D1AF95B-4303-497E-BDC3-00D7D69BA2FC}"/>
 </file>
</xml_diff>